<commit_message>
Add corrected homework 3
</commit_message>
<xml_diff>
--- a/homework3_db/screenshots and scripts.docx
+++ b/homework3_db/screenshots and scripts.docx
@@ -800,7 +800,18 @@
     </w:p>
     <w:p>
       <w:r>
-        <w:t>FROM Customers AS c, Orders AS o</w:t>
+        <w:t>FROM Customers AS c</w:t>
+      </w:r>
+    </w:p>
+    <w:p>
+      <w:r>
+        <w:t>INNER JOIN Orders AS o</w:t>
+      </w:r>
+    </w:p>
+    <w:p>
+      <w:r>
+        <w:tab/>
+        <w:t xml:space="preserve">ON c.customer_id = o.customer_id </w:t>
       </w:r>
     </w:p>
     <w:p>
@@ -821,7 +832,15 @@
       </w:r>
     </w:p>
     <w:p>
-      <w:r>
+      <w:pPr>
+        <w:rPr>
+          <w:lang w:val="en-US"/>
+        </w:rPr>
+      </w:pPr>
+      <w:r>
+        <w:rPr>
+          <w:lang w:val="en-US"/>
+        </w:rPr>
         <w:t>);</w:t>
       </w:r>
     </w:p>
@@ -1007,60 +1026,27 @@
     </w:p>
     <w:p>
       <w:r>
-        <w:t>WITH pre_table AS (</w:t>
-      </w:r>
-    </w:p>
-    <w:p>
-      <w:r>
         <w:t xml:space="preserve">SELECT </w:t>
       </w:r>
     </w:p>
     <w:p>
       <w:r>
-        <w:tab/>
-        <w:t>CONCAT(c.first_name, ' ', c.last_name) AS full_name,</w:t>
-      </w:r>
-    </w:p>
-    <w:p>
-      <w:r>
-        <w:tab/>
-        <w:t>c.country,</w:t>
-      </w:r>
-    </w:p>
-    <w:p>
-      <w:r>
-        <w:tab/>
-        <w:t>(SELECT count(*) AS total_orders</w:t>
-      </w:r>
-    </w:p>
-    <w:p>
-      <w:r>
-        <w:tab/>
-        <w:t>FROM Orders AS o</w:t>
-      </w:r>
-    </w:p>
-    <w:p>
-      <w:r>
-        <w:tab/>
-        <w:t>WHERE o.customer_id = c.customer_id),</w:t>
-      </w:r>
-    </w:p>
-    <w:p>
-      <w:r>
-        <w:tab/>
-        <w:t>(SELECT sum(amount) AS total_amount</w:t>
-      </w:r>
-    </w:p>
-    <w:p>
-      <w:r>
-        <w:tab/>
-        <w:t>FROM Orders AS o</w:t>
-      </w:r>
-    </w:p>
-    <w:p>
-      <w:r>
-        <w:tab/>
-        <w:t>WHERE o.customer_id = c.customer_id)</w:t>
+        <w:t xml:space="preserve">    CONCAT(c.first_name, ' ', c.last_name) AS full_name,</w:t>
+      </w:r>
+    </w:p>
+    <w:p>
+      <w:r>
+        <w:t xml:space="preserve">    c.country,</w:t>
+      </w:r>
+    </w:p>
+    <w:p>
+      <w:r>
+        <w:t xml:space="preserve">    COUNT(o.order_id) AS total_orders,</w:t>
+      </w:r>
+    </w:p>
+    <w:p>
+      <w:r>
+        <w:t xml:space="preserve">    SUM(o.amount) AS total_amount</w:t>
       </w:r>
     </w:p>
     <w:p>
@@ -1076,7 +1062,18 @@
     <w:p>
       <w:r>
         <w:tab/>
-        <w:t xml:space="preserve">ON c.customer_id = s.customer </w:t>
+        <w:t>ON c.customer_id = s.customer</w:t>
+      </w:r>
+    </w:p>
+    <w:p>
+      <w:r>
+        <w:t xml:space="preserve">INNER JOIN Orders AS o </w:t>
+      </w:r>
+    </w:p>
+    <w:p>
+      <w:r>
+        <w:tab/>
+        <w:t>ON c.customer_id = o.customer_id</w:t>
       </w:r>
     </w:p>
     <w:p>
@@ -1086,25 +1083,13 @@
     </w:p>
     <w:p>
       <w:r>
-        <w:t>)</w:t>
-      </w:r>
-    </w:p>
-    <w:p>
-      <w:r>
-        <w:t>SELECT *</w:t>
-      </w:r>
-    </w:p>
-    <w:p>
-      <w:r>
-        <w:t>FROM pre_table</w:t>
-      </w:r>
-    </w:p>
-    <w:p>
-      <w:r>
-        <w:t>WHERE total_orders &gt; 1;</w:t>
-      </w:r>
-    </w:p>
-    <w:p>
+        <w:t>GROUP BY c.first_name, c.last_name, c.country</w:t>
+      </w:r>
+    </w:p>
+    <w:p>
+      <w:r>
+        <w:t>HAVING COUNT(o.order_id) &gt; 1;</w:t>
+      </w:r>
       <w:r>
         <w:rPr>
           <w:noProof/>

</xml_diff>

<commit_message>
Add corrected homework 3 (part 7)
</commit_message>
<xml_diff>
--- a/homework3_db/screenshots and scripts.docx
+++ b/homework3_db/screenshots and scripts.docx
@@ -1026,6 +1026,11 @@
     </w:p>
     <w:p>
       <w:r>
+        <w:t>-- Select customers with at least 2 orders and delivery status = 'Delivered'</w:t>
+      </w:r>
+    </w:p>
+    <w:p>
+      <w:r>
         <w:t xml:space="preserve">SELECT </w:t>
       </w:r>
     </w:p>
@@ -1041,7 +1046,7 @@
     </w:p>
     <w:p>
       <w:r>
-        <w:t xml:space="preserve">    COUNT(o.order_id) AS total_orders,</w:t>
+        <w:t xml:space="preserve">    COUNT(o.customer_id) AS total_orders,</w:t>
       </w:r>
     </w:p>
     <w:p>
@@ -1088,8 +1093,10 @@
     </w:p>
     <w:p>
       <w:r>
-        <w:t>HAVING COUNT(o.order_id) &gt; 1;</w:t>
-      </w:r>
+        <w:t>HAVING COUNT(o.customer_id) &gt; 1;</w:t>
+      </w:r>
+    </w:p>
+    <w:p>
       <w:r>
         <w:rPr>
           <w:noProof/>

</xml_diff>

<commit_message>
Add corrected homework 3 (task 5 and 7)
</commit_message>
<xml_diff>
--- a/homework3_db/screenshots and scripts.docx
+++ b/homework3_db/screenshots and scripts.docx
@@ -826,12 +826,6 @@
       </w:r>
     </w:p>
     <w:p>
-      <w:r>
-        <w:tab/>
-        <w:t>WHERE c.customer_id = o.customer_id</w:t>
-      </w:r>
-    </w:p>
-    <w:p>
       <w:pPr>
         <w:rPr>
           <w:lang w:val="en-US"/>
@@ -1026,11 +1020,6 @@
     </w:p>
     <w:p>
       <w:r>
-        <w:t>-- Select customers with at least 2 orders and delivery status = 'Delivered'</w:t>
-      </w:r>
-    </w:p>
-    <w:p>
-      <w:r>
         <w:t xml:space="preserve">SELECT </w:t>
       </w:r>
     </w:p>
@@ -1046,7 +1035,7 @@
     </w:p>
     <w:p>
       <w:r>
-        <w:t xml:space="preserve">    COUNT(o.customer_id) AS total_orders,</w:t>
+        <w:t xml:space="preserve">    COUNT(o.order_id) AS total_orders,</w:t>
       </w:r>
     </w:p>
     <w:p>
@@ -1088,15 +1077,13 @@
     </w:p>
     <w:p>
       <w:r>
-        <w:t>GROUP BY c.first_name, c.last_name, c.country</w:t>
-      </w:r>
-    </w:p>
-    <w:p>
-      <w:r>
-        <w:t>HAVING COUNT(o.customer_id) &gt; 1;</w:t>
-      </w:r>
-    </w:p>
-    <w:p>
+        <w:t>GROUP BY c.customer_id</w:t>
+      </w:r>
+    </w:p>
+    <w:p>
+      <w:r>
+        <w:t>HAVING COUNT(o.order_id) &gt; 1;</w:t>
+      </w:r>
       <w:r>
         <w:rPr>
           <w:noProof/>

</xml_diff>